<commit_message>
feat:dev-intern add middle mcp server
</commit_message>
<xml_diff>
--- a/整个瓶颈链条是.docx
+++ b/整个瓶颈链条是.docx
@@ -143,7 +143,7 @@
         <w:t>设备不够 → 封装产能上不去 → HBM/芯片出不来 → 算力不够用</w:t>
       </w:r>
       <w:r>
-        <w:t>。其中先进封装是最卡脖子的一环，因为 HBM、GPU、CPO 三大方向同时在抢封装产能，而扩产需要时间。对应到你的持仓，</w:t>
+        <w:t>。其中先进封装是最卡脖子的一环，因为 HBM、GPU、CPO 三大方向同时在抢封装产能，而扩产需要时间。</w:t>
       </w:r>
       <w:r>
         <w:rPr>
@@ -4798,13 +4798,7 @@
         </w:tc>
       </w:tr>
     </w:tbl>
-    <w:p>
-      <w:pPr>
-        <w:rPr>
-          <w:rFonts w:hint="eastAsia"/>
-        </w:rPr>
-      </w:pPr>
-    </w:p>
+    <w:p/>
     <w:sectPr>
       <w:pgSz w:w="11906" w:h="16838"/>
       <w:pgMar w:top="1440" w:right="1800" w:bottom="1440" w:left="1800" w:header="851" w:footer="992" w:gutter="0"/>

</xml_diff>